<commit_message>
refactor: interfaz simple al estilo de la guía de clase
Usa qwen3.5:0.8b y la estructura de ollama5.py; manuales actualizados.

Co-Authored-By: Claude Opus 5.5 <noreply@anthropic.com>
</commit_message>
<xml_diff>
--- a/entrega/Documentacion_Desarrollador.docx
+++ b/entrega/Documentacion_Desarrollador.docx
@@ -4,367 +4,192 @@
   <w:body>
     <w:p>
       <w:r>
-        <w:t>MANUAL DEL DESARROLLADOR - Asistente Inventario Ferreteria PYME</w:t>
+        <w:t>Manual del desarrollador</w:t>
       </w:r>
     </w:p>
     <w:p>
       <w:r>
-        <w:t>Parte II-1: explicacion del codigo en general y detalles vitales</w:t>
+        <w:t>Asistente de Inventario para PYMES con Ollama local.</w:t>
       </w:r>
     </w:p>
     <w:p>
       <w:r>
-        <w:t>1. Vision general (30 segundos)</w:t>
+        <w:t>1. Visión general</w:t>
       </w:r>
     </w:p>
     <w:p>
       <w:r>
-        <w:t>App monolitica Python + Tkinter + Ollama local.</w:t>
+        <w:t>Todo el programa está en un solo archivo, main.py, escrito con Python, Tkinter y la librería ollama, siguiendo el estilo de los ejemplos vistos en clase (ollama1.py a ollama5.py).</w:t>
       </w:r>
     </w:p>
     <w:p>
       <w:r>
-        <w:t>Usuario (Tkinter 600x600) -&gt; Thread -&gt; ollama.chat(qwen2.5:3b) -&gt; Respuesta en chat</w:t>
+        <w:t>Flujo: el usuario escribe una consulta, el botón Enviar llama a ollama.chat con el modelo qwen3.5:0.8b y la respuesta se muestra en el área de texto.</w:t>
       </w:r>
     </w:p>
     <w:p>
       <w:r>
-        <w:t xml:space="preserve">                         -&gt; Guardar .txt (filedialog)</w:t>
+        <w:t>No usa internet, ni base de datos, ni servicios en la nube.</w:t>
       </w:r>
     </w:p>
     <w:p>
       <w:r>
-        <w:t xml:space="preserve">                         -&gt; Toplevel Integrantes (Pillow)</w:t>
+        <w:t>2. Partes del código</w:t>
       </w:r>
     </w:p>
     <w:p>
       <w:r>
-        <w:t>Sin backend, sin API cloud, sin base de datos. El "cerebro" es el modelo 3B</w:t>
+        <w:t>2.1 Configuración</w:t>
       </w:r>
     </w:p>
     <w:p>
       <w:r>
-        <w:t>inyectado con un SYSTEM_PROMPT ferretero. Historial en memoria (list[dict]).</w:t>
+        <w:t>- MODELO = "qwen3.5:0.8b": modelo destilado de menos de 3B parámetros, el mismo de la guía de clase.</w:t>
       </w:r>
     </w:p>
     <w:p>
       <w:r>
-        <w:t>Ficheros:</w:t>
+        <w:t>- INTEGRANTES: lista con nombre y carné de cada integrante.</w:t>
       </w:r>
     </w:p>
     <w:p>
       <w:r>
-        <w:t>- main.py (~230 lineas): todo (UI + logica + Ollama). Decision intencional para clase: un solo archivo = facil de explicar/defender.</w:t>
+        <w:t>- CONTEXTO: mensaje de sistema que le indica al modelo que actúe como asistente de inventario de una ferretería. Sin este mensaje el modelo responde de forma genérica.</w:t>
       </w:r>
     </w:p>
     <w:p>
       <w:r>
-        <w:t>- requirements.txt: ollama&gt;=0.4.0, pillow&gt;=10.0.0</w:t>
+        <w:t>- CARPETA: ruta donde está main.py, para encontrar la foto y guardar los .txt aunque el programa se ejecute desde otra carpeta.</w:t>
       </w:r>
     </w:p>
     <w:p>
       <w:r>
-        <w:t>- assets/foto.jpg: foto grupal, carga opcional con fallback.</w:t>
+        <w:t>2.2 Función enviar()</w:t>
       </w:r>
     </w:p>
     <w:p>
       <w:r>
-        <w:t>2. Mapa del codigo (por bloques)</w:t>
+        <w:t>- Valida que el campo no esté vacío.</w:t>
       </w:r>
     </w:p>
     <w:p>
       <w:r>
-        <w:t>2.1 Configuracion (main.py:26-54)</w:t>
+        <w:t>- Cambia la etiqueta de estado a "Consultando..." y llama root.update() para que se vea el cambio antes de esperar al modelo.</w:t>
       </w:r>
     </w:p>
     <w:p>
       <w:r>
-        <w:t>- VENTANA_W, VENTANA_H = 600, 600 -&gt; restriccion de catedra. resizable(False, False) la hace cumplir.</w:t>
+        <w:t>- Llama ollama.chat con dos mensajes: el de sistema (CONTEXTO) y el del usuario.</w:t>
       </w:r>
     </w:p>
     <w:p>
       <w:r>
-        <w:t>- MODEL_NAME = "qwen2.5:3b" -&gt; cumple regla &lt;=3B. Cambiar aqui cambia todo el sistema. Alternativas: llama3.2:3b, tinyllama.</w:t>
+        <w:t>- Agrega la pregunta y la respuesta al área de texto.</w:t>
       </w:r>
     </w:p>
     <w:p>
       <w:r>
-        <w:t>- SYSTEM_PROMPT -&gt; EL CORAZON del enfoque ferretero. Sin esto el modelo 3B responde generico. Incluye: rol, inventario por pasillo, ejemplos reales (tornillo 1/4, disco 4 1/2, cemento CESSA), redireccion de temas.</w:t>
+        <w:t>- Si Ollama no está abierto o el modelo no está descargado, muestra el error en un messagebox.</w:t>
       </w:r>
     </w:p>
     <w:p>
       <w:r>
-        <w:t>- INTEGRANTES -&gt; lista editable, se renderiza en ventana secundaria.</w:t>
+        <w:t>Detalle importante: ollama.chat espera la respuesta completa, por lo que la ventana queda ocupada mientras el modelo responde. Se eligió así por simplicidad, igual que en ollama5.py.</w:t>
       </w:r>
     </w:p>
     <w:p>
       <w:r>
-        <w:t>- Paleta C_AZUL, C_VERDE... -&gt; justificacion en Manual Usuario seccion 6.</w:t>
+        <w:t>2.3 Función guardar()</w:t>
       </w:r>
     </w:p>
     <w:p>
       <w:r>
-        <w:t>2.2 Capa Ollama (main.py:56-68)</w:t>
+        <w:t>- Toma todo el texto del área de respuestas.</w:t>
       </w:r>
     </w:p>
     <w:p>
       <w:r>
-        <w:t>import ollama</w:t>
+        <w:t>- Lo guarda en un archivo consulta_AAAAMMDD_HHMMSS.txt junto a main.py, con codificación UTF-8.</w:t>
       </w:r>
     </w:p>
     <w:p>
       <w:r>
-        <w:t>ollama.chat(model=MODEL_NAME, messages=historial)</w:t>
+        <w:t>2.4 Función ver_integrantes()</w:t>
       </w:r>
     </w:p>
     <w:p>
       <w:r>
-        <w:t>- historial formato OpenAI: [{role: system|user|assistant, content}].</w:t>
+        <w:t>- Abre una ventana nueva (Toplevel).</w:t>
       </w:r>
     </w:p>
     <w:p>
       <w:r>
-        <w:t>- Se envia HISTORIAL COMPLETO cada vez (memoria conversacional). Ojo vital: crece sin limite -&gt; en PC 8GB con charlas &gt;50 turnos puede alentarse. Mejora futura: truncar a ultimos 10.</w:t>
+        <w:t>- Si existe assets/foto.jpg, la muestra reducida con Pillow. La imagen se guarda en ventana.foto porque, si no se guarda una referencia, Tkinter la borra y no aparece.</w:t>
       </w:r>
     </w:p>
     <w:p>
       <w:r>
-        <w:t>- OLLAMA_LIB_OK flag para degradar con mensaje util si falta pip install.</w:t>
+        <w:t>- Muestra los nombres y carnés de INTEGRANTES.</w:t>
       </w:r>
     </w:p>
     <w:p>
       <w:r>
-        <w:t>- Toda excepcion (modelo no descargado, Ollama apagado) se captura y se traduce a 3 pasos accionables para el usuario. Detalle VITAL para la demo en clase.</w:t>
+        <w:t>2.5 Ventana principal</w:t>
       </w:r>
     </w:p>
     <w:p>
       <w:r>
-        <w:t>2.3 UI Tkinter (main.py:71-129, clase App)</w:t>
+        <w:t>- Tamaño fijo de 600x600 con resizable(False, False).</w:t>
       </w:r>
     </w:p>
     <w:p>
       <w:r>
-        <w:t>- App(tk.Tk): ventana raiz 600x600.</w:t>
+        <w:t>- Colores verdes, asociados a orden, control y dinero, adecuados para un asistente de inventario.</w:t>
       </w:r>
     </w:p>
     <w:p>
       <w:r>
-        <w:t>- _build_ui(): header Frame 70px + ScrolledText (chat read-only state=disabled) + Entry + Boton Enviar + botonera inferior.</w:t>
+        <w:t>- Controles: título, campo de consulta, botón Enviar consulta, área de respuestas, botones Guardar en .txt y Ver integrantes, y etiqueta de estado.</w:t>
       </w:r>
     </w:p>
     <w:p>
       <w:r>
-        <w:t>- ScrolledText se habilita solo para insertar (state=normal) y se vuelve a bloquear. Evita edicion accidental.</w:t>
+        <w:t>3. Dependencias</w:t>
       </w:r>
     </w:p>
     <w:p>
       <w:r>
-        <w:t>- Entry.bind("&lt;Return&gt;") -&gt; Enter = Enviar (UX).</w:t>
+        <w:t>- ollama 0.6.2: cliente para hablar con el servidor Ollama local.</w:t>
       </w:r>
     </w:p>
     <w:p>
       <w:r>
-        <w:t>- ventana_integrantes(): Toplevel 400x480, busca assets/foto.jpg|foto.png|integrantes.jpg, thumbnail((320,240)) con Pillow. Guarda referencia self._tkimg para evitar garbage collector (BUG CLASICO Tkinter: si no guardas referencia la imagen desaparece).</w:t>
+        <w:t>- pillow 12.3.0: para mostrar la foto JPG.</w:t>
       </w:r>
     </w:p>
     <w:p>
       <w:r>
-        <w:t>- Si no hay foto, placeholder con instrucciones. La app NUNCA crashea por falta de foto.</w:t>
+        <w:t>- Tkinter viene incluido con Python.</w:t>
       </w:r>
     </w:p>
     <w:p>
       <w:r>
-        <w:t>2.4 Concurrencia (main.py:140-167)</w:t>
+        <w:t>4. Posibles mejoras</w:t>
       </w:r>
     </w:p>
     <w:p>
       <w:r>
-        <w:t>threading.Thread(target=self._responder, daemon=True).start()</w:t>
+        <w:t>- Mostrar la respuesta por partes con stream=True, como en ollama2.py.</w:t>
       </w:r>
     </w:p>
     <w:p>
       <w:r>
-        <w:t>...</w:t>
+        <w:t>- Guardar el inventario en una base sqlite3.</w:t>
       </w:r>
     </w:p>
     <w:p>
       <w:r>
-        <w:t>self.after(0, self._mostrar_respuesta, respuesta)</w:t>
-      </w:r>
-    </w:p>
-    <w:p>
-      <w:r>
-        <w:t>DETALLE VITAL a defender ante el docente:</w:t>
-      </w:r>
-    </w:p>
-    <w:p>
-      <w:r>
-        <w:t>- ollama.chat es bloqueante (5-30 seg en CPU). Sin thread, la UI 600x600 se congelaria.</w:t>
-      </w:r>
-    </w:p>
-    <w:p>
-      <w:r>
-        <w:t>- El thread hace la consulta, luego after(0,...) vuelve al hilo principal (Tkinter NO es thread-safe, solo el main thread toca widgets).</w:t>
-      </w:r>
-    </w:p>
-    <w:p>
-      <w:r>
-        <w:t>- daemon=True para que al cerrar la ventana no quede hilo colgado.</w:t>
-      </w:r>
-    </w:p>
-    <w:p>
-      <w:r>
-        <w:t>- Boton cambia a "..." y se deshabilita para evitar doble envio.</w:t>
-      </w:r>
-    </w:p>
-    <w:p>
-      <w:r>
-        <w:t>2.5 Persistencia (main.py:169-183)</w:t>
-      </w:r>
-    </w:p>
-    <w:p>
-      <w:r>
-        <w:t>- filedialog.asksaveasfilename + open(..., encoding=utf-8).</w:t>
-      </w:r>
-    </w:p>
-    <w:p>
-      <w:r>
-        <w:t>- Incluye timestamp + modelo para trazabilidad academica.</w:t>
-      </w:r>
-    </w:p>
-    <w:p>
-      <w:r>
-        <w:t>- Sin dependencias externas.</w:t>
-      </w:r>
-    </w:p>
-    <w:p>
-      <w:r>
-        <w:t>3. Decisiones de arquitectura y tradeoffs</w:t>
-      </w:r>
-    </w:p>
-    <w:p>
-      <w:r>
-        <w:t>1. Tkinter vs PyQt/CustomTkinter: Tkinter viene en stdlib, cero friccion instalacion en lab UFG. Contra: feo por defecto, se compensa con paleta plana.</w:t>
-      </w:r>
-    </w:p>
-    <w:p>
-      <w:r>
-        <w:t>2. Un solo archivo vs hexagonal: Para 600x600 + 3 botones, separar en capas es over-engineering y complica la defensa. Se documenta para escalar a src/ui, src/core si crece.</w:t>
-      </w:r>
-    </w:p>
-    <w:p>
-      <w:r>
-        <w:t>3. Modelo 3B vs 7B+: Catedra exige &lt;=3B y 100% local en laptops 8GB. qwen2.5:3b equilibra espanol + instrucciones. tinyllama es mas rapido pero peor espanol.</w:t>
-      </w:r>
-    </w:p>
-    <w:p>
-      <w:r>
-        <w:t>4. Historial completo vs RAG: No hay base vectorial; el dominio ferretero va en prompt. Suficiente para alcance clase. Evolucion: SQLite para Kardex real + RAG sobre catalogo.</w:t>
-      </w:r>
-    </w:p>
-    <w:p>
-      <w:r>
-        <w:t>4. Como extender (ideas para defender nota)</w:t>
-      </w:r>
-    </w:p>
-    <w:p>
-      <w:r>
-        <w:t>- Agregar ComboBox selector de modelo (qwen2.5:3b, llama3.2:3b) leyendo ollama list.</w:t>
-      </w:r>
-    </w:p>
-    <w:p>
-      <w:r>
-        <w:t>- Guardar Kardex en sqlite3 (stdlib): tabla movimientos(fecha, sku, tipo, cant).</w:t>
-      </w:r>
-    </w:p>
-    <w:p>
-      <w:r>
-        <w:t>- Limitar historial: self.historial[-11:] + system.</w:t>
-      </w:r>
-    </w:p>
-    <w:p>
-      <w:r>
-        <w:t>- Exportar a CSV ademas de .txt para Excel de la ferreteria.</w:t>
-      </w:r>
-    </w:p>
-    <w:p>
-      <w:r>
-        <w:t>5. Guia GitHub (subir todo)</w:t>
-      </w:r>
-    </w:p>
-    <w:p>
-      <w:r>
-        <w:t>cd parcial-inventario-ollama</w:t>
-      </w:r>
-    </w:p>
-    <w:p>
-      <w:r>
-        <w:t>git init -b main</w:t>
-      </w:r>
-    </w:p>
-    <w:p>
-      <w:r>
-        <w:t>git add main.py requirements.txt README.md .gitignore assets/ docs/</w:t>
-      </w:r>
-    </w:p>
-    <w:p>
-      <w:r>
-        <w:t>git commit -m "feat: asistente inventario ferreteria PYME con Ollama local 3B"</w:t>
-      </w:r>
-    </w:p>
-    <w:p>
-      <w:r>
-        <w:t># crear repo vacio en github.com (ej: ferreteria-inventario-ufg) y luego:</w:t>
-      </w:r>
-    </w:p>
-    <w:p>
-      <w:r>
-        <w:t>git remote add origin https://github.com/TU_USUARIO/ferreteria-inventario-ufg.git</w:t>
-      </w:r>
-    </w:p>
-    <w:p>
-      <w:r>
-        <w:t>git push -u origin main</w:t>
-      </w:r>
-    </w:p>
-    <w:p>
-      <w:r>
-        <w:t>No subir: __pycache__/, *.txt generados (ya en .gitignore).</w:t>
-      </w:r>
-    </w:p>
-    <w:p>
-      <w:r>
-        <w:t>Foto: subir assets/foto.jpg (si pesa &gt;10MB, comprimir).</w:t>
-      </w:r>
-    </w:p>
-    <w:p>
-      <w:r>
-        <w:t>6. Checklist defensa Parte II</w:t>
-      </w:r>
-    </w:p>
-    <w:p>
-      <w:r>
-        <w:t>- [ ] Mostrar ollama list con modelo &lt;=3B.</w:t>
-      </w:r>
-    </w:p>
-    <w:p>
-      <w:r>
-        <w:t>- [ ] Abrir con python main.py, verificar 600x600.</w:t>
-      </w:r>
-    </w:p>
-    <w:p>
-      <w:r>
-        <w:t>- [ ] Pregunta ferretera en vivo + Guardar .txt + abrir ventana Integrantes.</w:t>
-      </w:r>
-    </w:p>
-    <w:p>
-      <w:r>
-        <w:t>- [ ] Explicar thread + after() y por que sin eso se congela.</w:t>
-      </w:r>
-    </w:p>
-    <w:p>
-      <w:r>
-        <w:t>- [ ] Explicar SYSTEM_PROMPT como especializacion sin reentrenar.</w:t>
+        <w:t>- Permitir elegir el modelo desde una lista.</w:t>
       </w:r>
     </w:p>
     <w:sectPr>

</xml_diff>

<commit_message>
docs: foto del grupo y manuales Word actualizados
Co-Authored-By: Claude Opus 5.5 <noreply@anthropic.com>
</commit_message>
<xml_diff>
--- a/entrega/Documentacion_Desarrollador.docx
+++ b/entrega/Documentacion_Desarrollador.docx
@@ -9,7 +9,7 @@
     </w:p>
     <w:p>
       <w:r>
-        <w:t>Asistente de Inventario para PYMES con Ollama local.</w:t>
+        <w:t>Asistente de Inventario PYME con Ollama local.</w:t>
       </w:r>
     </w:p>
     <w:p>
@@ -19,142 +19,107 @@
     </w:p>
     <w:p>
       <w:r>
-        <w:t>Todo el programa está en un solo archivo, main.py, escrito con Python, Tkinter y la librería ollama, siguiendo el estilo de los ejemplos vistos en clase (ollama1.py a ollama5.py).</w:t>
+        <w:t>El programa está en un solo archivo, main.py, escrito con Python, Tkinter (con widgets ttk) y la librería ollama. Se ejecuta 100% en local con el modelo destilado qwen3.5:0.8b, de menos de 3B parámetros.</w:t>
       </w:r>
     </w:p>
     <w:p>
       <w:r>
-        <w:t>Flujo: el usuario escribe una consulta, el botón Enviar llama a ollama.chat con el modelo qwen3.5:0.8b y la respuesta se muestra en el área de texto.</w:t>
+        <w:t>Flujo: el usuario escribe una consulta, el botón Enviar llama a ollama.chat, la respuesta se agrega al historial y todo el historial se puede guardar en un .txt.</w:t>
       </w:r>
     </w:p>
     <w:p>
       <w:r>
-        <w:t>No usa internet, ni base de datos, ni servicios en la nube.</w:t>
+        <w:t>2. Configuración (inicio del archivo)</w:t>
       </w:r>
     </w:p>
     <w:p>
       <w:r>
-        <w:t>2. Partes del código</w:t>
+        <w:t>- MODELO: nombre del modelo de Ollama. Cambiarlo aquí cambia el modelo en todo el programa.</w:t>
       </w:r>
     </w:p>
     <w:p>
       <w:r>
-        <w:t>2.1 Configuración</w:t>
+        <w:t>- CONTEXTO: mensaje de sistema que le indica al modelo que actúe como asistente de inventario para PYMES. Sin este mensaje el modelo responde de forma genérica.</w:t>
       </w:r>
     </w:p>
     <w:p>
       <w:r>
-        <w:t>- MODELO = "qwen3.5:0.8b": modelo destilado de menos de 3B parámetros, el mismo de la guía de clase.</w:t>
+        <w:t>- WINDOW_WIDTH y WINDOW_HEIGHT: 600x600, tamaño exigido. La ventana no se puede redimensionar.</w:t>
       </w:r>
     </w:p>
     <w:p>
       <w:r>
-        <w:t>- INTEGRANTES: lista con nombre y carné de cada integrante.</w:t>
+        <w:t>- COLORS: paleta verde azulado con fondo claro, asociada a orden, confianza y control, adecuada para un asistente de inventario.</w:t>
       </w:r>
     </w:p>
     <w:p>
       <w:r>
-        <w:t>- CONTEXTO: mensaje de sistema que le indica al modelo que actúe como asistente de inventario de una ferretería. Sin este mensaje el modelo responde de forma genérica.</w:t>
+        <w:t>3. Clase InventarioApp</w:t>
       </w:r>
     </w:p>
     <w:p>
       <w:r>
-        <w:t>- CARPETA: ruta donde está main.py, para encontrar la foto y guardar los .txt aunque el programa se ejecute desde otra carpeta.</w:t>
+        <w:t>- __init__: crea la ventana, fija el tamaño y construye estilos e interfaz. Guarda la conversación en la lista self.conversacion.</w:t>
       </w:r>
     </w:p>
     <w:p>
       <w:r>
-        <w:t>2.2 Función enviar()</w:t>
+        <w:t>- construir_estilos: define los estilos ttk del botón principal y de los secundarios.</w:t>
       </w:r>
     </w:p>
     <w:p>
       <w:r>
-        <w:t>- Valida que el campo no esté vacío.</w:t>
+        <w:t>- construir_interfaz: arma el encabezado, el historial (Text de solo lectura con barra de desplazamiento), el campo de consulta, el botón Enviar y los botones de guardar e integrantes. La tecla Enter también envía.</w:t>
       </w:r>
     </w:p>
     <w:p>
       <w:r>
-        <w:t>- Cambia la etiqueta de estado a "Consultando..." y llama root.update() para que se vea el cambio antes de esperar al modelo.</w:t>
+        <w:t>- agregar_mensaje: inserta un mensaje en el historial y lo guarda en self.conversacion.</w:t>
       </w:r>
     </w:p>
     <w:p>
       <w:r>
-        <w:t>- Llama ollama.chat con dos mensajes: el de sistema (CONTEXTO) y el del usuario.</w:t>
+        <w:t>- obtener_respuesta: llama a ollama.chat con el CONTEXTO y la consulta. Si Ollama no está abierto o falta el modelo, devuelve un mensaje con la solución en lugar de cerrar el programa.</w:t>
       </w:r>
     </w:p>
     <w:p>
       <w:r>
-        <w:t>- Agrega la pregunta y la respuesta al área de texto.</w:t>
+        <w:t>- enviar_consulta: valida que la consulta no esté vacía, la muestra, cambia el cursor a espera, llama a root.update() para refrescar la ventana y luego muestra la respuesta del modelo.</w:t>
       </w:r>
     </w:p>
     <w:p>
       <w:r>
-        <w:t>- Si Ollama no está abierto o el modelo no está descargado, muestra el error en un messagebox.</w:t>
+        <w:t>- guardar_conversacion: abre un cuadro para elegir dónde guardar (por defecto documento.txt) y escribe la fecha y toda la conversación en UTF-8.</w:t>
       </w:r>
     </w:p>
     <w:p>
       <w:r>
-        <w:t>Detalle importante: ollama.chat espera la respuesta completa, por lo que la ventana queda ocupada mientras el modelo responde. Se eligió así por simplicidad, igual que en ollama5.py.</w:t>
+        <w:t>- mostrar_integrantes: abre una ventana nueva con la primera imagen de la carpeta "foto integrantes" y los nombres y carnés del grupo. La imagen se guarda en self.imagen_referencia porque, si no se guarda una referencia, Tkinter la borra y no aparece.</w:t>
       </w:r>
     </w:p>
     <w:p>
       <w:r>
-        <w:t>2.3 Función guardar()</w:t>
+        <w:t>4. Detalles importantes</w:t>
       </w:r>
     </w:p>
     <w:p>
       <w:r>
-        <w:t>- Toma todo el texto del área de respuestas.</w:t>
+        <w:t>- ollama.chat espera la respuesta completa, así que mientras el modelo responde la ventana queda ocupada unos segundos. Se eligió así por simplicidad.</w:t>
       </w:r>
     </w:p>
     <w:p>
       <w:r>
-        <w:t>- Lo guarda en un archivo consulta_AAAAMMDD_HHMMSS.txt junto a main.py, con codificación UTF-8.</w:t>
+        <w:t>- Si Pillow no está instalado, el botón de integrantes muestra un aviso en lugar de fallar.</w:t>
       </w:r>
     </w:p>
     <w:p>
       <w:r>
-        <w:t>2.4 Función ver_integrantes()</w:t>
+        <w:t>- No se usa internet, base de datos ni servicios en la nube.</w:t>
       </w:r>
     </w:p>
     <w:p>
       <w:r>
-        <w:t>- Abre una ventana nueva (Toplevel).</w:t>
-      </w:r>
-    </w:p>
-    <w:p>
-      <w:r>
-        <w:t>- Si existe assets/foto.jpg, la muestra reducida con Pillow. La imagen se guarda en ventana.foto porque, si no se guarda una referencia, Tkinter la borra y no aparece.</w:t>
-      </w:r>
-    </w:p>
-    <w:p>
-      <w:r>
-        <w:t>- Muestra los nombres y carnés de INTEGRANTES.</w:t>
-      </w:r>
-    </w:p>
-    <w:p>
-      <w:r>
-        <w:t>2.5 Ventana principal</w:t>
-      </w:r>
-    </w:p>
-    <w:p>
-      <w:r>
-        <w:t>- Tamaño fijo de 600x600 con resizable(False, False).</w:t>
-      </w:r>
-    </w:p>
-    <w:p>
-      <w:r>
-        <w:t>- Colores verdes, asociados a orden, control y dinero, adecuados para un asistente de inventario.</w:t>
-      </w:r>
-    </w:p>
-    <w:p>
-      <w:r>
-        <w:t>- Controles: título, campo de consulta, botón Enviar consulta, área de respuestas, botones Guardar en .txt y Ver integrantes, y etiqueta de estado.</w:t>
-      </w:r>
-    </w:p>
-    <w:p>
-      <w:r>
-        <w:t>3. Dependencias</w:t>
+        <w:t>5. Dependencias</w:t>
       </w:r>
     </w:p>
     <w:p>
@@ -164,7 +129,7 @@
     </w:p>
     <w:p>
       <w:r>
-        <w:t>- pillow 12.3.0: para mostrar la foto JPG.</w:t>
+        <w:t>- pillow 12.3.0: para mostrar la foto JPEG.</w:t>
       </w:r>
     </w:p>
     <w:p>
@@ -174,22 +139,22 @@
     </w:p>
     <w:p>
       <w:r>
-        <w:t>4. Posibles mejoras</w:t>
+        <w:t>6. Posibles mejoras</w:t>
       </w:r>
     </w:p>
     <w:p>
       <w:r>
-        <w:t>- Mostrar la respuesta por partes con stream=True, como en ollama2.py.</w:t>
+        <w:t>- Mostrar la respuesta por partes con stream=True.</w:t>
       </w:r>
     </w:p>
     <w:p>
       <w:r>
-        <w:t>- Guardar el inventario en una base sqlite3.</w:t>
+        <w:t>- Guardar el inventario real en una base sqlite3.</w:t>
       </w:r>
     </w:p>
     <w:p>
       <w:r>
-        <w:t>- Permitir elegir el modelo desde una lista.</w:t>
+        <w:t>- Enviar el historial completo al modelo para que recuerde la conversación.</w:t>
       </w:r>
     </w:p>
     <w:sectPr>

</xml_diff>

<commit_message>
fix: la ventana ya no se congela al consultar
La consulta corre en un hilo aparte y se desactiva el razonamiento de
qwen3.5 (think=False), que llevaba la respuesta de 7 s a 69 s. Se agrega
un inventario de ejemplo al contexto.

Co-Authored-By: Claude Opus 5.5 <noreply@anthropic.com>
</commit_message>
<xml_diff>
--- a/entrega/Documentacion_Desarrollador.docx
+++ b/entrega/Documentacion_Desarrollador.docx
@@ -39,7 +39,7 @@
     </w:p>
     <w:p>
       <w:r>
-        <w:t>- CONTEXTO: mensaje de sistema que le indica al modelo que actúe como asistente de inventario para PYMES. Sin este mensaje el modelo responde de forma genérica.</w:t>
+        <w:t>- CONTEXTO: mensaje de sistema que le indica al modelo que actúe como asistente de inventario para PYMES e incluye un inventario de ejemplo (arroz, frijol, aceite, azúcar, leche en polvo y café) para que pueda responder preguntas como "¿cuál es el inventario que tenemos?".</w:t>
       </w:r>
     </w:p>
     <w:p>
@@ -79,12 +79,17 @@
     </w:p>
     <w:p>
       <w:r>
-        <w:t>- obtener_respuesta: llama a ollama.chat con el CONTEXTO y la consulta. Si Ollama no está abierto o falta el modelo, devuelve un mensaje con la solución en lugar de cerrar el programa.</w:t>
+        <w:t>- obtener_respuesta: llama a ollama.chat con el CONTEXTO, la consulta y think=False. Si Ollama no está abierto o falta el modelo, devuelve un mensaje con la solución en lugar de cerrar el programa.</w:t>
       </w:r>
     </w:p>
     <w:p>
       <w:r>
-        <w:t>- enviar_consulta: valida que la consulta no esté vacía, la muestra, cambia el cursor a espera, llama a root.update() para refrescar la ventana y luego muestra la respuesta del modelo.</w:t>
+        <w:t>- enviar_consulta: valida que la consulta no esté vacía, la muestra, desactiva el botón (que dice "Pensando...") y lanza la consulta en un hilo aparte.</w:t>
+      </w:r>
+    </w:p>
+    <w:p>
+      <w:r>
+        <w:t>- consultar_en_segundo_plano y mostrar_respuesta: el hilo espera al modelo y, con root.after, devuelve la respuesta al hilo principal, que es el único que puede modificar la ventana.</w:t>
       </w:r>
     </w:p>
     <w:p>
@@ -104,7 +109,12 @@
     </w:p>
     <w:p>
       <w:r>
-        <w:t>- ollama.chat espera la respuesta completa, así que mientras el modelo responde la ventana queda ocupada unos segundos. Se eligió así por simplicidad.</w:t>
+        <w:t>- La consulta corre en un hilo aparte (threading) para que la ventana no se congele mientras el modelo responde.</w:t>
+      </w:r>
+    </w:p>
+    <w:p>
+      <w:r>
+        <w:t>- think=False desactiva el razonamiento previo de qwen3.5. En pruebas del 24/09/2026, la misma pregunta tardó 68.9 s con razonamiento y 7.3 s sin él.</w:t>
       </w:r>
     </w:p>
     <w:p>

</xml_diff>

<commit_message>
feat: ejecutable AsistenteInventario.exe con PyInstaller
La ruta de la foto se toma junto al .exe cuando el programa está
compilado. PyInstaller 6.22.3 se registra en el stack, auditado con
pip-audit sin vulnerabilidades.

Co-Authored-By: Claude Opus 5.5 <noreply@anthropic.com>
</commit_message>
<xml_diff>
--- a/entrega/Documentacion_Desarrollador.docx
+++ b/entrega/Documentacion_Desarrollador.docx
@@ -149,7 +149,42 @@
     </w:p>
     <w:p>
       <w:r>
-        <w:t>6. Posibles mejoras</w:t>
+        <w:t>6. Generar el ejecutable</w:t>
+      </w:r>
+    </w:p>
+    <w:p>
+      <w:r>
+        <w:t>El archivo AsistenteInventario.exe se genera con PyInstaller 6.22.3, desde la carpeta entrega:</w:t>
+      </w:r>
+    </w:p>
+    <w:p>
+      <w:r>
+        <w:t>pip install pyinstaller==6.22.3</w:t>
+      </w:r>
+    </w:p>
+    <w:p>
+      <w:r>
+        <w:t>python -m PyInstaller --onefile --windowed --name AsistenteInventario --distpath . main.py</w:t>
+      </w:r>
+    </w:p>
+    <w:p>
+      <w:r>
+        <w:t>- --onefile empaqueta todo en un solo archivo y --windowed evita que se abra la consola negra.</w:t>
+      </w:r>
+    </w:p>
+    <w:p>
+      <w:r>
+        <w:t>- La constante CARPETA usa la ubicación del .exe cuando el programa está compilado (sys.frozen), porque en ese caso __file__ apunta a una carpeta temporal. Así encuentra la carpeta "foto integrantes".</w:t>
+      </w:r>
+    </w:p>
+    <w:p>
+      <w:r>
+        <w:t>- Ollama no se incluye en el .exe: debe estar instalado y abierto en la computadora.</w:t>
+      </w:r>
+    </w:p>
+    <w:p>
+      <w:r>
+        <w:t>7. Posibles mejoras</w:t>
       </w:r>
     </w:p>
     <w:p>

</xml_diff>